<commit_message>
chore: sync PROGRESS.md — add AI Assistant + Dokumen Referensi + PejabatSekolah + ReferensiKode
</commit_message>
<xml_diff>
--- a/template/BUKU TAMU KEDINASAN.docx
+++ b/template/BUKU TAMU KEDINASAN.docx
@@ -1,6 +1,6 @@
 
 <file path=word/document.xml><?xml version="1.0" encoding="utf-8"?>
-<w:document xmlns:wpc="http://schemas.microsoft.com/office/word/2010/wordprocessingCanvas" xmlns:cx="http://schemas.microsoft.com/office/drawing/2014/chartex" xmlns:cx1="http://schemas.microsoft.com/office/drawing/2015/9/8/chartex" xmlns:cx2="http://schemas.microsoft.com/office/drawing/2015/10/21/chartex" xmlns:cx3="http://schemas.microsoft.com/office/drawing/2016/5/9/chartex" xmlns:cx4="http://schemas.microsoft.com/office/drawing/2016/5/10/chartex" xmlns:cx5="http://schemas.microsoft.com/office/drawing/2016/5/11/chartex" xmlns:cx6="http://schemas.microsoft.com/office/drawing/2016/5/12/chartex" xmlns:cx7="http://schemas.microsoft.com/office/drawing/2016/5/13/chartex" xmlns:cx8="http://schemas.microsoft.com/office/drawing/2016/5/14/chartex" xmlns:mc="http://schemas.openxmlformats.org/markup-compatibility/2006" xmlns:aink="http://schemas.microsoft.com/office/drawing/2016/ink" xmlns:am3d="http://schemas.microsoft.com/office/drawing/2017/model3d" xmlns:o="urn:schemas-microsoft-com:office:office" xmlns:oel="http://schemas.microsoft.com/office/2019/extlst" xmlns:r="http://schemas.openxmlformats.org/officeDocument/2006/relationships" xmlns:m="http://schemas.openxmlformats.org/officeDocument/2006/math" xmlns:v="urn:schemas-microsoft-com:vml" xmlns:wp14="http://schemas.microsoft.com/office/word/2010/wordprocessingDrawing" xmlns:wp="http://schemas.openxmlformats.org/drawingml/2006/wordprocessingDrawing" xmlns:w10="urn:schemas-microsoft-com:office:word" xmlns:w="http://schemas.openxmlformats.org/wordprocessingml/2006/main" xmlns:w14="http://schemas.microsoft.com/office/word/2010/wordml" xmlns:w15="http://schemas.microsoft.com/office/word/2012/wordml" xmlns:w16cex="http://schemas.microsoft.com/office/word/2018/wordml/cex" xmlns:w16cid="http://schemas.microsoft.com/office/word/2016/wordml/cid" xmlns:w16="http://schemas.microsoft.com/office/word/2018/wordml" xmlns:w16du="http://schemas.microsoft.com/office/word/2023/wordml/word16du" xmlns:w16sdtdh="http://schemas.microsoft.com/office/word/2020/wordml/sdtdatahash" xmlns:w16sdtfl="http://schemas.microsoft.com/office/word/2024/wordml/sdtformatlock" xmlns:w16se="http://schemas.microsoft.com/office/word/2015/wordml/symex" xmlns:wpg="http://schemas.microsoft.com/office/word/2010/wordprocessingGroup" xmlns:wpi="http://schemas.microsoft.com/office/word/2010/wordprocessingInk" xmlns:wne="http://schemas.microsoft.com/office/word/2006/wordml" xmlns:wps="http://schemas.microsoft.com/office/word/2010/wordprocessingShape" mc:Ignorable="w14 w15 w16se w16cid w16 w16cex w16sdtdh w16sdtfl w16du wp14">
+<w:document xmlns:wpc="http://schemas.microsoft.com/office/word/2010/wordprocessingCanvas" xmlns:cx="http://schemas.microsoft.com/office/drawing/2014/chartex" xmlns:cx1="http://schemas.microsoft.com/office/drawing/2015/9/8/chartex" xmlns:cx2="http://schemas.microsoft.com/office/drawing/2015/10/21/chartex" xmlns:cx3="http://schemas.microsoft.com/office/drawing/2016/5/9/chartex" xmlns:cx4="http://schemas.microsoft.com/office/drawing/2016/5/10/chartex" xmlns:cx5="http://schemas.microsoft.com/office/drawing/2016/5/11/chartex" xmlns:cx6="http://schemas.microsoft.com/office/drawing/2016/5/12/chartex" xmlns:cx7="http://schemas.microsoft.com/office/drawing/2016/5/13/chartex" xmlns:cx8="http://schemas.microsoft.com/office/drawing/2016/5/14/chartex" xmlns:mc="http://schemas.openxmlformats.org/markup-compatibility/2006" xmlns:aink="http://schemas.microsoft.com/office/drawing/2016/ink" xmlns:am3d="http://schemas.microsoft.com/office/drawing/2017/model3d" xmlns:o="urn:schemas-microsoft-com:office:office" xmlns:oel="http://schemas.microsoft.com/office/2019/extlst" xmlns:r="http://schemas.openxmlformats.org/officeDocument/2006/relationships" xmlns:m="http://schemas.openxmlformats.org/officeDocument/2006/math" xmlns:v="urn:schemas-microsoft-com:vml" xmlns:wp14="http://schemas.microsoft.com/office/word/2010/wordprocessingDrawing" xmlns:wp="http://schemas.openxmlformats.org/drawingml/2006/wordprocessingDrawing" xmlns:w10="urn:schemas-microsoft-com:office:word" xmlns:w="http://schemas.openxmlformats.org/wordprocessingml/2006/main" xmlns:w14="http://schemas.microsoft.com/office/word/2010/wordml" xmlns:w15="http://schemas.microsoft.com/office/word/2012/wordml" xmlns:w16cex="http://schemas.microsoft.com/office/word/2018/wordml/cex" xmlns:w16cid="http://schemas.microsoft.com/office/word/2016/wordml/cid" xmlns:w16="http://schemas.microsoft.com/office/word/2018/wordml" xmlns:w16sdtdh="http://schemas.microsoft.com/office/word/2020/wordml/sdtdatahash" xmlns:w16se="http://schemas.microsoft.com/office/word/2015/wordml/symex" xmlns:wpg="http://schemas.microsoft.com/office/word/2010/wordprocessingGroup" xmlns:wpi="http://schemas.microsoft.com/office/word/2010/wordprocessingInk" xmlns:wne="http://schemas.microsoft.com/office/word/2006/wordml" xmlns:wps="http://schemas.microsoft.com/office/word/2010/wordprocessingShape" mc:Ignorable="w14 w15 w16se w16cid w16 w16cex w16sdtdh wp14">
   <w:body>
     <w:p>
       <w:pPr>
@@ -44,30 +44,6 @@
           <w:szCs w:val="92"/>
         </w:rPr>
         <w:t>BUKU TAMU</w:t>
-      </w:r>
-    </w:p>
-    <w:p>
-      <w:pPr>
-        <w:pStyle w:val="NoSpacing"/>
-        <w:spacing w:line="276" w:lineRule="auto"/>
-        <w:jc w:val="center"/>
-        <w:rPr>
-          <w:rFonts w:ascii="Tahoma" w:hAnsi="Tahoma" w:cs="Tahoma"/>
-          <w:b/>
-          <w:color w:val="C00000"/>
-          <w:sz w:val="100"/>
-          <w:szCs w:val="92"/>
-        </w:rPr>
-      </w:pPr>
-      <w:r>
-        <w:rPr>
-          <w:rFonts w:ascii="Tahoma" w:hAnsi="Tahoma" w:cs="Tahoma"/>
-          <w:b/>
-          <w:color w:val="C00000"/>
-          <w:sz w:val="100"/>
-          <w:szCs w:val="92"/>
-        </w:rPr>
-        <w:t>KEDINASAN</w:t>
       </w:r>
     </w:p>
     <w:p>
@@ -105,13 +81,97 @@
         <w:pStyle w:val="NoSpacing"/>
         <w:jc w:val="center"/>
         <w:rPr>
-          <w:rFonts w:ascii="Tahoma" w:hAnsi="Tahoma" w:cs="Tahoma"/>
-          <w:b/>
-          <w:bCs/>
-          <w:spacing w:val="1"/>
-          <w:position w:val="-2"/>
-          <w:sz w:val="36"/>
-          <w:szCs w:val="40"/>
+          <w:noProof/>
+        </w:rPr>
+      </w:pPr>
+    </w:p>
+    <w:p>
+      <w:pPr>
+        <w:pStyle w:val="NoSpacing"/>
+        <w:jc w:val="center"/>
+        <w:rPr>
+          <w:noProof/>
+        </w:rPr>
+      </w:pPr>
+    </w:p>
+    <w:p>
+      <w:pPr>
+        <w:pStyle w:val="NoSpacing"/>
+        <w:jc w:val="center"/>
+        <w:rPr>
+          <w:noProof/>
+        </w:rPr>
+      </w:pPr>
+    </w:p>
+    <w:p>
+      <w:pPr>
+        <w:pStyle w:val="NoSpacing"/>
+        <w:jc w:val="center"/>
+        <w:rPr>
+          <w:noProof/>
+        </w:rPr>
+      </w:pPr>
+    </w:p>
+    <w:p>
+      <w:pPr>
+        <w:pStyle w:val="NoSpacing"/>
+        <w:jc w:val="center"/>
+        <w:rPr>
+          <w:noProof/>
+        </w:rPr>
+      </w:pPr>
+    </w:p>
+    <w:p>
+      <w:pPr>
+        <w:pStyle w:val="NoSpacing"/>
+        <w:jc w:val="center"/>
+        <w:rPr>
+          <w:noProof/>
+        </w:rPr>
+      </w:pPr>
+    </w:p>
+    <w:p>
+      <w:pPr>
+        <w:pStyle w:val="NoSpacing"/>
+        <w:jc w:val="center"/>
+        <w:rPr>
+          <w:noProof/>
+        </w:rPr>
+      </w:pPr>
+    </w:p>
+    <w:p>
+      <w:pPr>
+        <w:pStyle w:val="NoSpacing"/>
+        <w:jc w:val="center"/>
+        <w:rPr>
+          <w:noProof/>
+        </w:rPr>
+      </w:pPr>
+    </w:p>
+    <w:p>
+      <w:pPr>
+        <w:pStyle w:val="NoSpacing"/>
+        <w:jc w:val="center"/>
+        <w:rPr>
+          <w:noProof/>
+        </w:rPr>
+      </w:pPr>
+    </w:p>
+    <w:p>
+      <w:pPr>
+        <w:pStyle w:val="NoSpacing"/>
+        <w:jc w:val="center"/>
+        <w:rPr>
+          <w:noProof/>
+        </w:rPr>
+      </w:pPr>
+    </w:p>
+    <w:p>
+      <w:pPr>
+        <w:pStyle w:val="NoSpacing"/>
+        <w:jc w:val="center"/>
+        <w:rPr>
+          <w:noProof/>
         </w:rPr>
       </w:pPr>
     </w:p>
@@ -123,59 +183,6 @@
           <w:rFonts w:ascii="Franklin Gothic Demi Cond" w:hAnsi="Franklin Gothic Demi Cond"/>
         </w:rPr>
       </w:pPr>
-      <w:r>
-        <w:rPr>
-          <w:noProof/>
-        </w:rPr>
-        <w:drawing>
-          <wp:inline distT="0" distB="0" distL="0" distR="0" wp14:anchorId="3DF8ACB9" wp14:editId="08070C0D">
-            <wp:extent cx="2945219" cy="2945219"/>
-            <wp:effectExtent l="0" t="0" r="0" b="7620"/>
-            <wp:docPr id="598788847" name="Picture 1"/>
-            <wp:cNvGraphicFramePr>
-              <a:graphicFrameLocks xmlns:a="http://schemas.openxmlformats.org/drawingml/2006/main" noChangeAspect="1"/>
-            </wp:cNvGraphicFramePr>
-            <a:graphic xmlns:a="http://schemas.openxmlformats.org/drawingml/2006/main">
-              <a:graphicData uri="http://schemas.openxmlformats.org/drawingml/2006/picture">
-                <pic:pic xmlns:pic="http://schemas.openxmlformats.org/drawingml/2006/picture">
-                  <pic:nvPicPr>
-                    <pic:cNvPr id="0" name="Picture 1"/>
-                    <pic:cNvPicPr>
-                      <a:picLocks noChangeAspect="1" noChangeArrowheads="1"/>
-                    </pic:cNvPicPr>
-                  </pic:nvPicPr>
-                  <pic:blipFill>
-                    <a:blip r:embed="rId4" cstate="print">
-                      <a:extLst>
-                        <a:ext uri="{28A0092B-C50C-407E-A947-70E740481C1C}">
-                          <a14:useLocalDpi xmlns:a14="http://schemas.microsoft.com/office/drawing/2010/main" val="0"/>
-                        </a:ext>
-                      </a:extLst>
-                    </a:blip>
-                    <a:srcRect/>
-                    <a:stretch>
-                      <a:fillRect/>
-                    </a:stretch>
-                  </pic:blipFill>
-                  <pic:spPr bwMode="auto">
-                    <a:xfrm>
-                      <a:off x="0" y="0"/>
-                      <a:ext cx="2983448" cy="2983448"/>
-                    </a:xfrm>
-                    <a:prstGeom prst="rect">
-                      <a:avLst/>
-                    </a:prstGeom>
-                    <a:noFill/>
-                    <a:ln>
-                      <a:noFill/>
-                    </a:ln>
-                  </pic:spPr>
-                </pic:pic>
-              </a:graphicData>
-            </a:graphic>
-          </wp:inline>
-        </w:drawing>
-      </w:r>
     </w:p>
     <w:p>
       <w:pPr>
@@ -236,7 +243,16 @@
           <w:sz w:val="54"/>
           <w:szCs w:val="46"/>
         </w:rPr>
-        <w:t>SD NEGERI LEBAKLEUNGSIR</w:t>
+        <w:t xml:space="preserve">SD NEGERI </w:t>
+      </w:r>
+      <w:r>
+        <w:rPr>
+          <w:rFonts w:ascii="Tahoma" w:hAnsi="Tahoma" w:cs="Tahoma"/>
+          <w:b/>
+          <w:sz w:val="54"/>
+          <w:szCs w:val="46"/>
+        </w:rPr>
+        <w:t>PASIRHALANG</w:t>
       </w:r>
     </w:p>
     <w:p>
@@ -424,7 +440,7 @@
                     </pic:cNvPicPr>
                   </pic:nvPicPr>
                   <pic:blipFill>
-                    <a:blip r:embed="rId5" cstate="print">
+                    <a:blip r:embed="rId4" cstate="print">
                       <a:lum bright="6000"/>
                     </a:blip>
                     <a:srcRect/>
@@ -607,7 +623,7 @@
           <w:sz w:val="14"/>
           <w:szCs w:val="20"/>
         </w:rPr>
-        <w:t xml:space="preserve"> 10 Desa </w:t>
+        <w:t xml:space="preserve"> 10 </w:t>
       </w:r>
       <w:proofErr w:type="spellStart"/>
       <w:r>
@@ -617,7 +633,7 @@
           <w:sz w:val="14"/>
           <w:szCs w:val="20"/>
         </w:rPr>
-        <w:t>Mekarjaya</w:t>
+        <w:t>Desa</w:t>
       </w:r>
       <w:proofErr w:type="spellEnd"/>
       <w:r>
@@ -637,7 +653,7 @@
           <w:sz w:val="14"/>
           <w:szCs w:val="20"/>
         </w:rPr>
-        <w:t>Kec</w:t>
+        <w:t>Mekarjaya</w:t>
       </w:r>
       <w:proofErr w:type="spellEnd"/>
       <w:r>
@@ -647,7 +663,7 @@
           <w:sz w:val="14"/>
           <w:szCs w:val="20"/>
         </w:rPr>
-        <w:t xml:space="preserve">. </w:t>
+        <w:t xml:space="preserve"> </w:t>
       </w:r>
       <w:proofErr w:type="spellStart"/>
       <w:r>
@@ -657,7 +673,7 @@
           <w:sz w:val="14"/>
           <w:szCs w:val="20"/>
         </w:rPr>
-        <w:t>Cikalongwetan</w:t>
+        <w:t>Kec</w:t>
       </w:r>
       <w:proofErr w:type="spellEnd"/>
       <w:r>
@@ -667,7 +683,7 @@
           <w:sz w:val="14"/>
           <w:szCs w:val="20"/>
         </w:rPr>
-        <w:t xml:space="preserve"> Kode Pos 40556 </w:t>
+        <w:t xml:space="preserve">. </w:t>
       </w:r>
       <w:proofErr w:type="spellStart"/>
       <w:r>
@@ -677,7 +693,7 @@
           <w:sz w:val="14"/>
           <w:szCs w:val="20"/>
         </w:rPr>
-        <w:t>Kab</w:t>
+        <w:t>Cikalongwetan</w:t>
       </w:r>
       <w:proofErr w:type="spellEnd"/>
       <w:r>
@@ -687,6 +703,26 @@
           <w:sz w:val="14"/>
           <w:szCs w:val="20"/>
         </w:rPr>
+        <w:t xml:space="preserve"> Kode Pos 40556 </w:t>
+      </w:r>
+      <w:proofErr w:type="spellStart"/>
+      <w:r>
+        <w:rPr>
+          <w:rFonts w:ascii="Arial" w:hAnsi="Arial" w:cs="Arial"/>
+          <w:i/>
+          <w:sz w:val="14"/>
+          <w:szCs w:val="20"/>
+        </w:rPr>
+        <w:t>Kab</w:t>
+      </w:r>
+      <w:proofErr w:type="spellEnd"/>
+      <w:r>
+        <w:rPr>
+          <w:rFonts w:ascii="Arial" w:hAnsi="Arial" w:cs="Arial"/>
+          <w:i/>
+          <w:sz w:val="14"/>
+          <w:szCs w:val="20"/>
+        </w:rPr>
         <w:t>. Bandung Barat</w:t>
       </w:r>
     </w:p>
@@ -730,569 +766,348 @@
     <w:p>
       <w:pPr>
         <w:pStyle w:val="NoSpacing"/>
-        <w:jc w:val="center"/>
-        <w:rPr>
-          <w:rFonts w:ascii="Tahoma" w:hAnsi="Tahoma" w:cs="Tahoma"/>
-          <w:b/>
-        </w:rPr>
-      </w:pPr>
-      <w:r>
-        <w:rPr>
-          <w:rFonts w:ascii="Bookman Old Style" w:hAnsi="Bookman Old Style"/>
-          <w:b/>
+        <w:ind w:left="720"/>
+        <w:jc w:val="center"/>
+        <w:rPr>
+          <w:rFonts w:ascii="Arial Narrow" w:hAnsi="Arial Narrow" w:cs="Arial"/>
+        </w:rPr>
+      </w:pPr>
+      <w:r>
+        <w:rPr>
+          <w:rFonts w:ascii="Arial Narrow" w:hAnsi="Arial Narrow" w:cs="Arial"/>
           <w:noProof/>
+          <w:sz w:val="26"/>
           <w:lang w:val="id-ID" w:eastAsia="id-ID"/>
         </w:rPr>
         <w:lastRenderedPageBreak/>
-        <mc:AlternateContent>
-          <mc:Choice Requires="wps">
-            <w:drawing>
-              <wp:anchor distT="0" distB="0" distL="114300" distR="114300" simplePos="0" relativeHeight="251660288" behindDoc="0" locked="0" layoutInCell="1" allowOverlap="1" wp14:anchorId="75095EB9" wp14:editId="0383C4BD">
-                <wp:simplePos x="0" y="0"/>
-                <wp:positionH relativeFrom="margin">
-                  <wp:posOffset>850998</wp:posOffset>
-                </wp:positionH>
-                <wp:positionV relativeFrom="paragraph">
-                  <wp:posOffset>10160</wp:posOffset>
-                </wp:positionV>
-                <wp:extent cx="5394960" cy="914400"/>
-                <wp:effectExtent l="0" t="0" r="15240" b="19050"/>
-                <wp:wrapNone/>
-                <wp:docPr id="2" name="Text Box 2"/>
-                <wp:cNvGraphicFramePr/>
-                <a:graphic xmlns:a="http://schemas.openxmlformats.org/drawingml/2006/main">
-                  <a:graphicData uri="http://schemas.microsoft.com/office/word/2010/wordprocessingShape">
-                    <wps:wsp>
-                      <wps:cNvSpPr txBox="1"/>
-                      <wps:spPr>
-                        <a:xfrm>
-                          <a:off x="0" y="0"/>
-                          <a:ext cx="5394960" cy="914400"/>
-                        </a:xfrm>
-                        <a:prstGeom prst="rect">
-                          <a:avLst/>
-                        </a:prstGeom>
-                        <a:noFill/>
-                        <a:ln w="6350">
-                          <a:solidFill>
-                            <a:prstClr val="black"/>
-                          </a:solidFill>
-                        </a:ln>
-                        <a:effectLst/>
-                      </wps:spPr>
-                      <wps:style>
-                        <a:lnRef idx="0">
-                          <a:schemeClr val="accent1"/>
-                        </a:lnRef>
-                        <a:fillRef idx="0">
-                          <a:schemeClr val="accent1"/>
-                        </a:fillRef>
-                        <a:effectRef idx="0">
-                          <a:schemeClr val="accent1"/>
-                        </a:effectRef>
-                        <a:fontRef idx="minor">
-                          <a:schemeClr val="dk1"/>
-                        </a:fontRef>
-                      </wps:style>
-                      <wps:txbx>
-                        <w:txbxContent>
-                          <w:p>
-                            <w:pPr>
-                              <w:pStyle w:val="NoSpacing"/>
-                              <w:jc w:val="center"/>
-                              <w:rPr>
-                                <w:rFonts w:ascii="Arial Black" w:hAnsi="Arial Black"/>
-                                <w:b/>
-                                <w:color w:val="000000" w:themeColor="text1"/>
-                                <w:sz w:val="32"/>
-                                <w:lang w:val="id-ID"/>
-                              </w:rPr>
-                            </w:pPr>
-                            <w:r>
-                              <w:rPr>
-                                <w:rFonts w:ascii="Arial Black" w:hAnsi="Arial Black"/>
-                                <w:b/>
-                                <w:color w:val="000000" w:themeColor="text1"/>
-                                <w:sz w:val="32"/>
-                                <w:lang w:val="id-ID"/>
-                              </w:rPr>
-                              <w:t>BUKU TAMU</w:t>
-                            </w:r>
-                            <w:r>
-                              <w:rPr>
-                                <w:rFonts w:ascii="Arial Black" w:hAnsi="Arial Black"/>
-                                <w:b/>
-                                <w:color w:val="000000" w:themeColor="text1"/>
-                                <w:sz w:val="32"/>
-                                <w:lang w:val="id-ID"/>
-                              </w:rPr>
-                              <w:t xml:space="preserve"> KEDINASAN</w:t>
-                            </w:r>
-                          </w:p>
-                          <w:p>
-                            <w:pPr>
-                              <w:pStyle w:val="NoSpacing"/>
-                              <w:jc w:val="center"/>
-                              <w:rPr>
-                                <w:rFonts w:ascii="Arial Black" w:hAnsi="Arial Black"/>
-                                <w:b/>
-                                <w:color w:val="0070C0"/>
-                                <w:sz w:val="30"/>
-                                <w:szCs w:val="28"/>
-                                <w:lang w:val="id-ID"/>
-                              </w:rPr>
-                            </w:pPr>
-                            <w:r>
-                              <w:rPr>
-                                <w:rFonts w:ascii="Arial Black" w:hAnsi="Arial Black"/>
-                                <w:b/>
-                                <w:color w:val="0070C0"/>
-                                <w:sz w:val="30"/>
-                                <w:szCs w:val="28"/>
-                                <w:lang w:val="id-ID"/>
-                              </w:rPr>
-                              <w:t>Kunjungan, Pembinaan, Pengawasan,</w:t>
-                            </w:r>
-                          </w:p>
-                          <w:p>
-                            <w:pPr>
-                              <w:pStyle w:val="NoSpacing"/>
-                              <w:jc w:val="center"/>
-                              <w:rPr>
-                                <w:rFonts w:ascii="Arial Black" w:hAnsi="Arial Black"/>
-                                <w:b/>
-                                <w:color w:val="000000" w:themeColor="text1"/>
-                                <w:sz w:val="26"/>
-                                <w:szCs w:val="26"/>
-                                <w:lang w:val="id-ID"/>
-                              </w:rPr>
-                            </w:pPr>
-                            <w:r>
-                              <w:rPr>
-                                <w:rFonts w:ascii="Arial Black" w:hAnsi="Arial Black"/>
-                                <w:b/>
-                                <w:color w:val="0070C0"/>
-                                <w:sz w:val="30"/>
-                                <w:szCs w:val="28"/>
-                                <w:lang w:val="id-ID"/>
-                              </w:rPr>
-                              <w:t>Monitoring dan Evaluasi Pendidikan</w:t>
-                            </w:r>
-                            <w:r>
-                              <w:rPr>
-                                <w:rFonts w:ascii="Arial Black" w:hAnsi="Arial Black"/>
-                                <w:b/>
-                                <w:color w:val="0070C0"/>
-                                <w:sz w:val="30"/>
-                                <w:szCs w:val="28"/>
-                                <w:lang w:val="id-ID"/>
-                              </w:rPr>
-                              <w:t xml:space="preserve"> </w:t>
-                            </w:r>
-                          </w:p>
-                        </w:txbxContent>
-                      </wps:txbx>
-                      <wps:bodyPr rot="0" spcFirstLastPara="0" vertOverflow="overflow" horzOverflow="overflow" vert="horz" wrap="square" lIns="91440" tIns="45720" rIns="91440" bIns="45720" numCol="1" spcCol="0" rtlCol="0" fromWordArt="0" anchor="t" anchorCtr="0" forceAA="0" compatLnSpc="1">
-                        <a:prstTxWarp prst="textNoShape">
-                          <a:avLst/>
-                        </a:prstTxWarp>
-                        <a:noAutofit/>
-                      </wps:bodyPr>
-                    </wps:wsp>
-                  </a:graphicData>
-                </a:graphic>
-                <wp14:sizeRelH relativeFrom="margin">
-                  <wp14:pctWidth>0</wp14:pctWidth>
-                </wp14:sizeRelH>
-                <wp14:sizeRelV relativeFrom="margin">
-                  <wp14:pctHeight>0</wp14:pctHeight>
-                </wp14:sizeRelV>
-              </wp:anchor>
-            </w:drawing>
-          </mc:Choice>
-          <mc:Fallback>
-            <w:pict>
-              <v:shapetype w14:anchorId="75095EB9" id="_x0000_t202" coordsize="21600,21600" o:spt="202" path="m,l,21600r21600,l21600,xe">
-                <v:stroke joinstyle="miter"/>
-                <v:path gradientshapeok="t" o:connecttype="rect"/>
-              </v:shapetype>
-              <v:shape id="Text Box 2" o:spid="_x0000_s1026" type="#_x0000_t202" style="position:absolute;left:0;text-align:left;margin-left:67pt;margin-top:.8pt;width:424.8pt;height:1in;z-index:251660288;visibility:visible;mso-wrap-style:square;mso-width-percent:0;mso-height-percent:0;mso-wrap-distance-left:9pt;mso-wrap-distance-top:0;mso-wrap-distance-right:9pt;mso-wrap-distance-bottom:0;mso-position-horizontal:absolute;mso-position-horizontal-relative:margin;mso-position-vertical:absolute;mso-position-vertical-relative:text;mso-width-percent:0;mso-height-percent:0;mso-width-relative:margin;mso-height-relative:margin;v-text-anchor:top" o:gfxdata="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" filled="f" strokeweight=".5pt">
-                <v:textbox>
-                  <w:txbxContent>
-                    <w:p>
-                      <w:pPr>
-                        <w:pStyle w:val="NoSpacing"/>
-                        <w:jc w:val="center"/>
-                        <w:rPr>
-                          <w:rFonts w:ascii="Arial Black" w:hAnsi="Arial Black"/>
-                          <w:b/>
-                          <w:color w:val="000000" w:themeColor="text1"/>
-                          <w:sz w:val="32"/>
-                          <w:lang w:val="id-ID"/>
-                        </w:rPr>
-                      </w:pPr>
-                      <w:r>
-                        <w:rPr>
-                          <w:rFonts w:ascii="Arial Black" w:hAnsi="Arial Black"/>
-                          <w:b/>
-                          <w:color w:val="000000" w:themeColor="text1"/>
-                          <w:sz w:val="32"/>
-                          <w:lang w:val="id-ID"/>
-                        </w:rPr>
-                        <w:t>BUKU TAMU</w:t>
-                      </w:r>
-                      <w:r>
-                        <w:rPr>
-                          <w:rFonts w:ascii="Arial Black" w:hAnsi="Arial Black"/>
-                          <w:b/>
-                          <w:color w:val="000000" w:themeColor="text1"/>
-                          <w:sz w:val="32"/>
-                          <w:lang w:val="id-ID"/>
-                        </w:rPr>
-                        <w:t xml:space="preserve"> KEDINASAN</w:t>
-                      </w:r>
-                    </w:p>
-                    <w:p>
-                      <w:pPr>
-                        <w:pStyle w:val="NoSpacing"/>
-                        <w:jc w:val="center"/>
-                        <w:rPr>
-                          <w:rFonts w:ascii="Arial Black" w:hAnsi="Arial Black"/>
-                          <w:b/>
-                          <w:color w:val="0070C0"/>
-                          <w:sz w:val="30"/>
-                          <w:szCs w:val="28"/>
-                          <w:lang w:val="id-ID"/>
-                        </w:rPr>
-                      </w:pPr>
-                      <w:r>
-                        <w:rPr>
-                          <w:rFonts w:ascii="Arial Black" w:hAnsi="Arial Black"/>
-                          <w:b/>
-                          <w:color w:val="0070C0"/>
-                          <w:sz w:val="30"/>
-                          <w:szCs w:val="28"/>
-                          <w:lang w:val="id-ID"/>
-                        </w:rPr>
-                        <w:t>Kunjungan, Pembinaan, Pengawasan,</w:t>
-                      </w:r>
-                    </w:p>
-                    <w:p>
-                      <w:pPr>
-                        <w:pStyle w:val="NoSpacing"/>
-                        <w:jc w:val="center"/>
-                        <w:rPr>
-                          <w:rFonts w:ascii="Arial Black" w:hAnsi="Arial Black"/>
-                          <w:b/>
-                          <w:color w:val="000000" w:themeColor="text1"/>
-                          <w:sz w:val="26"/>
-                          <w:szCs w:val="26"/>
-                          <w:lang w:val="id-ID"/>
-                        </w:rPr>
-                      </w:pPr>
-                      <w:r>
-                        <w:rPr>
-                          <w:rFonts w:ascii="Arial Black" w:hAnsi="Arial Black"/>
-                          <w:b/>
-                          <w:color w:val="0070C0"/>
-                          <w:sz w:val="30"/>
-                          <w:szCs w:val="28"/>
-                          <w:lang w:val="id-ID"/>
-                        </w:rPr>
-                        <w:t>Monitoring dan Evaluasi Pendidikan</w:t>
-                      </w:r>
-                      <w:r>
-                        <w:rPr>
-                          <w:rFonts w:ascii="Arial Black" w:hAnsi="Arial Black"/>
-                          <w:b/>
-                          <w:color w:val="0070C0"/>
-                          <w:sz w:val="30"/>
-                          <w:szCs w:val="28"/>
-                          <w:lang w:val="id-ID"/>
-                        </w:rPr>
-                        <w:t xml:space="preserve"> </w:t>
-                      </w:r>
-                    </w:p>
-                  </w:txbxContent>
-                </v:textbox>
-                <w10:wrap anchorx="margin"/>
-              </v:shape>
-            </w:pict>
-          </mc:Fallback>
-        </mc:AlternateContent>
-      </w:r>
-      <w:r>
-        <w:rPr>
-          <w:rFonts w:asciiTheme="majorHAnsi" w:hAnsiTheme="majorHAnsi" w:cs="Arial"/>
-          <w:b/>
-          <w:noProof/>
-          <w:sz w:val="12"/>
-          <w:lang w:val="id-ID" w:eastAsia="id-ID"/>
-        </w:rPr>
-        <mc:AlternateContent>
-          <mc:Choice Requires="wps">
-            <w:drawing>
-              <wp:anchor distT="0" distB="0" distL="114300" distR="114300" simplePos="0" relativeHeight="251661312" behindDoc="0" locked="0" layoutInCell="1" allowOverlap="1" wp14:anchorId="711F3EEE" wp14:editId="56BE1A1C">
-                <wp:simplePos x="0" y="0"/>
-                <wp:positionH relativeFrom="margin">
-                  <wp:posOffset>-5862</wp:posOffset>
-                </wp:positionH>
-                <wp:positionV relativeFrom="paragraph">
-                  <wp:posOffset>10160</wp:posOffset>
-                </wp:positionV>
-                <wp:extent cx="854710" cy="914400"/>
-                <wp:effectExtent l="0" t="0" r="21590" b="19050"/>
-                <wp:wrapNone/>
-                <wp:docPr id="1" name="Text Box 1"/>
-                <wp:cNvGraphicFramePr/>
-                <a:graphic xmlns:a="http://schemas.openxmlformats.org/drawingml/2006/main">
-                  <a:graphicData uri="http://schemas.microsoft.com/office/word/2010/wordprocessingShape">
-                    <wps:wsp>
-                      <wps:cNvSpPr txBox="1"/>
-                      <wps:spPr>
-                        <a:xfrm>
-                          <a:off x="0" y="0"/>
-                          <a:ext cx="854710" cy="914400"/>
-                        </a:xfrm>
-                        <a:prstGeom prst="rect">
-                          <a:avLst/>
-                        </a:prstGeom>
-                        <a:solidFill>
-                          <a:schemeClr val="lt1"/>
-                        </a:solidFill>
-                        <a:ln w="6350">
-                          <a:solidFill>
-                            <a:prstClr val="black"/>
-                          </a:solidFill>
-                        </a:ln>
-                        <a:effectLst/>
-                      </wps:spPr>
-                      <wps:style>
-                        <a:lnRef idx="0">
-                          <a:schemeClr val="accent1"/>
-                        </a:lnRef>
-                        <a:fillRef idx="0">
-                          <a:schemeClr val="accent1"/>
-                        </a:fillRef>
-                        <a:effectRef idx="0">
-                          <a:schemeClr val="accent1"/>
-                        </a:effectRef>
-                        <a:fontRef idx="minor">
-                          <a:schemeClr val="dk1"/>
-                        </a:fontRef>
-                      </wps:style>
-                      <wps:txbx>
-                        <w:txbxContent>
-                          <w:p>
-                            <w:pPr>
-                              <w:spacing w:before="120"/>
-                              <w:jc w:val="center"/>
-                            </w:pPr>
-                            <w:r>
-                              <w:rPr>
-                                <w:noProof/>
-                              </w:rPr>
-                              <w:drawing>
-                                <wp:inline distT="0" distB="0" distL="0" distR="0" wp14:anchorId="5116631D" wp14:editId="62E52F5E">
-                                  <wp:extent cx="687070" cy="687070"/>
-                                  <wp:effectExtent l="0" t="0" r="0" b="0"/>
-                                  <wp:docPr id="645050587" name="Picture 1"/>
-                                  <wp:cNvGraphicFramePr>
-                                    <a:graphicFrameLocks xmlns:a="http://schemas.openxmlformats.org/drawingml/2006/main" noChangeAspect="1"/>
-                                  </wp:cNvGraphicFramePr>
-                                  <a:graphic xmlns:a="http://schemas.openxmlformats.org/drawingml/2006/main">
-                                    <a:graphicData uri="http://schemas.openxmlformats.org/drawingml/2006/picture">
-                                      <pic:pic xmlns:pic="http://schemas.openxmlformats.org/drawingml/2006/picture">
-                                        <pic:nvPicPr>
-                                          <pic:cNvPr id="0" name="Picture 1"/>
-                                          <pic:cNvPicPr>
-                                            <a:picLocks noChangeAspect="1" noChangeArrowheads="1"/>
-                                          </pic:cNvPicPr>
-                                        </pic:nvPicPr>
-                                        <pic:blipFill>
-                                          <a:blip r:embed="rId4" cstate="print">
-                                            <a:extLst>
-                                              <a:ext uri="{28A0092B-C50C-407E-A947-70E740481C1C}">
-                                                <a14:useLocalDpi xmlns:a14="http://schemas.microsoft.com/office/drawing/2010/main" val="0"/>
-                                              </a:ext>
-                                            </a:extLst>
-                                          </a:blip>
-                                          <a:srcRect/>
-                                          <a:stretch>
-                                            <a:fillRect/>
-                                          </a:stretch>
-                                        </pic:blipFill>
-                                        <pic:spPr bwMode="auto">
-                                          <a:xfrm>
-                                            <a:off x="0" y="0"/>
-                                            <a:ext cx="687070" cy="687070"/>
-                                          </a:xfrm>
-                                          <a:prstGeom prst="rect">
-                                            <a:avLst/>
-                                          </a:prstGeom>
-                                          <a:noFill/>
-                                          <a:ln>
-                                            <a:noFill/>
-                                          </a:ln>
-                                        </pic:spPr>
-                                      </pic:pic>
-                                    </a:graphicData>
-                                  </a:graphic>
-                                </wp:inline>
-                              </w:drawing>
-                            </w:r>
-                          </w:p>
-                        </w:txbxContent>
-                      </wps:txbx>
-                      <wps:bodyPr rot="0" spcFirstLastPara="0" vertOverflow="overflow" horzOverflow="overflow" vert="horz" wrap="square" lIns="91440" tIns="45720" rIns="91440" bIns="45720" numCol="1" spcCol="0" rtlCol="0" fromWordArt="0" anchor="t" anchorCtr="0" forceAA="0" compatLnSpc="1">
-                        <a:prstTxWarp prst="textNoShape">
-                          <a:avLst/>
-                        </a:prstTxWarp>
-                        <a:noAutofit/>
-                      </wps:bodyPr>
-                    </wps:wsp>
-                  </a:graphicData>
-                </a:graphic>
-                <wp14:sizeRelH relativeFrom="margin">
-                  <wp14:pctWidth>0</wp14:pctWidth>
-                </wp14:sizeRelH>
-                <wp14:sizeRelV relativeFrom="margin">
-                  <wp14:pctHeight>0</wp14:pctHeight>
-                </wp14:sizeRelV>
-              </wp:anchor>
-            </w:drawing>
-          </mc:Choice>
-          <mc:Fallback>
-            <w:pict>
-              <v:shape w14:anchorId="711F3EEE" id="Text Box 1" o:spid="_x0000_s1027" type="#_x0000_t202" style="position:absolute;left:0;text-align:left;margin-left:-.45pt;margin-top:.8pt;width:67.3pt;height:1in;z-index:251661312;visibility:visible;mso-wrap-style:square;mso-width-percent:0;mso-height-percent:0;mso-wrap-distance-left:9pt;mso-wrap-distance-top:0;mso-wrap-distance-right:9pt;mso-wrap-distance-bottom:0;mso-position-horizontal:absolute;mso-position-horizontal-relative:margin;mso-position-vertical:absolute;mso-position-vertical-relative:text;mso-width-percent:0;mso-height-percent:0;mso-width-relative:margin;mso-height-relative:margin;v-text-anchor:top" o:gfxdata="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" fillcolor="white [3201]" strokeweight=".5pt">
-                <v:textbox>
-                  <w:txbxContent>
-                    <w:p>
-                      <w:pPr>
-                        <w:spacing w:before="120"/>
-                        <w:jc w:val="center"/>
-                      </w:pPr>
-                      <w:r>
-                        <w:rPr>
-                          <w:noProof/>
-                        </w:rPr>
-                        <w:drawing>
-                          <wp:inline distT="0" distB="0" distL="0" distR="0" wp14:anchorId="5116631D" wp14:editId="62E52F5E">
-                            <wp:extent cx="687070" cy="687070"/>
-                            <wp:effectExtent l="0" t="0" r="0" b="0"/>
-                            <wp:docPr id="645050587" name="Picture 1"/>
-                            <wp:cNvGraphicFramePr>
-                              <a:graphicFrameLocks xmlns:a="http://schemas.openxmlformats.org/drawingml/2006/main" noChangeAspect="1"/>
-                            </wp:cNvGraphicFramePr>
-                            <a:graphic xmlns:a="http://schemas.openxmlformats.org/drawingml/2006/main">
-                              <a:graphicData uri="http://schemas.openxmlformats.org/drawingml/2006/picture">
-                                <pic:pic xmlns:pic="http://schemas.openxmlformats.org/drawingml/2006/picture">
-                                  <pic:nvPicPr>
-                                    <pic:cNvPr id="0" name="Picture 1"/>
-                                    <pic:cNvPicPr>
-                                      <a:picLocks noChangeAspect="1" noChangeArrowheads="1"/>
-                                    </pic:cNvPicPr>
-                                  </pic:nvPicPr>
-                                  <pic:blipFill>
-                                    <a:blip r:embed="rId4" cstate="print">
-                                      <a:extLst>
-                                        <a:ext uri="{28A0092B-C50C-407E-A947-70E740481C1C}">
-                                          <a14:useLocalDpi xmlns:a14="http://schemas.microsoft.com/office/drawing/2010/main" val="0"/>
-                                        </a:ext>
-                                      </a:extLst>
-                                    </a:blip>
-                                    <a:srcRect/>
-                                    <a:stretch>
-                                      <a:fillRect/>
-                                    </a:stretch>
-                                  </pic:blipFill>
-                                  <pic:spPr bwMode="auto">
-                                    <a:xfrm>
-                                      <a:off x="0" y="0"/>
-                                      <a:ext cx="687070" cy="687070"/>
-                                    </a:xfrm>
-                                    <a:prstGeom prst="rect">
-                                      <a:avLst/>
-                                    </a:prstGeom>
-                                    <a:noFill/>
-                                    <a:ln>
-                                      <a:noFill/>
-                                    </a:ln>
-                                  </pic:spPr>
-                                </pic:pic>
-                              </a:graphicData>
-                            </a:graphic>
-                          </wp:inline>
-                        </w:drawing>
-                      </w:r>
-                    </w:p>
-                  </w:txbxContent>
-                </v:textbox>
-                <w10:wrap anchorx="margin"/>
-              </v:shape>
-            </w:pict>
-          </mc:Fallback>
-        </mc:AlternateContent>
-      </w:r>
-    </w:p>
-    <w:p>
-      <w:pPr>
-        <w:pStyle w:val="NoSpacing"/>
-        <w:jc w:val="center"/>
-        <w:rPr>
-          <w:rFonts w:ascii="Bookman Old Style" w:hAnsi="Bookman Old Style"/>
-          <w:b/>
-          <w:lang w:val="id-ID"/>
-        </w:rPr>
-      </w:pPr>
-    </w:p>
-    <w:p>
-      <w:pPr>
-        <w:pStyle w:val="NoSpacing"/>
-        <w:jc w:val="center"/>
-        <w:rPr>
-          <w:rFonts w:ascii="Bookman Old Style" w:hAnsi="Bookman Old Style"/>
-          <w:b/>
+        <w:drawing>
+          <wp:anchor distT="0" distB="0" distL="114300" distR="114300" simplePos="0" relativeHeight="251665408" behindDoc="1" locked="0" layoutInCell="1" allowOverlap="1" wp14:anchorId="159B59A1" wp14:editId="03CA3B53">
+            <wp:simplePos x="0" y="0"/>
+            <wp:positionH relativeFrom="column">
+              <wp:posOffset>-5715</wp:posOffset>
+            </wp:positionH>
+            <wp:positionV relativeFrom="paragraph">
+              <wp:posOffset>31115</wp:posOffset>
+            </wp:positionV>
+            <wp:extent cx="647700" cy="620395"/>
+            <wp:effectExtent l="0" t="0" r="0" b="8255"/>
+            <wp:wrapTight wrapText="bothSides">
+              <wp:wrapPolygon edited="0">
+                <wp:start x="0" y="0"/>
+                <wp:lineTo x="0" y="21224"/>
+                <wp:lineTo x="20965" y="21224"/>
+                <wp:lineTo x="20965" y="0"/>
+                <wp:lineTo x="0" y="0"/>
+              </wp:wrapPolygon>
+            </wp:wrapTight>
+            <wp:docPr id="14" name="Picture 14" descr="Kabupaten_Bandung_Barat"/>
+            <wp:cNvGraphicFramePr>
+              <a:graphicFrameLocks xmlns:a="http://schemas.openxmlformats.org/drawingml/2006/main" noChangeAspect="1"/>
+            </wp:cNvGraphicFramePr>
+            <a:graphic xmlns:a="http://schemas.openxmlformats.org/drawingml/2006/main">
+              <a:graphicData uri="http://schemas.openxmlformats.org/drawingml/2006/picture">
+                <pic:pic xmlns:pic="http://schemas.openxmlformats.org/drawingml/2006/picture">
+                  <pic:nvPicPr>
+                    <pic:cNvPr id="0" name="Picture 2" descr="Kabupaten_Bandung_Barat"/>
+                    <pic:cNvPicPr>
+                      <a:picLocks noChangeAspect="1" noChangeArrowheads="1"/>
+                    </pic:cNvPicPr>
+                  </pic:nvPicPr>
+                  <pic:blipFill>
+                    <a:blip r:embed="rId4" cstate="print">
+                      <a:lum bright="6000"/>
+                    </a:blip>
+                    <a:srcRect/>
+                    <a:stretch>
+                      <a:fillRect/>
+                    </a:stretch>
+                  </pic:blipFill>
+                  <pic:spPr bwMode="auto">
+                    <a:xfrm>
+                      <a:off x="0" y="0"/>
+                      <a:ext cx="647700" cy="620395"/>
+                    </a:xfrm>
+                    <a:prstGeom prst="rect">
+                      <a:avLst/>
+                    </a:prstGeom>
+                    <a:noFill/>
+                    <a:ln w="9525">
+                      <a:noFill/>
+                      <a:miter lim="800000"/>
+                      <a:headEnd/>
+                      <a:tailEnd/>
+                    </a:ln>
+                  </pic:spPr>
+                </pic:pic>
+              </a:graphicData>
+            </a:graphic>
+            <wp14:sizeRelH relativeFrom="margin">
+              <wp14:pctWidth>0</wp14:pctWidth>
+            </wp14:sizeRelH>
+            <wp14:sizeRelV relativeFrom="margin">
+              <wp14:pctHeight>0</wp14:pctHeight>
+            </wp14:sizeRelV>
+          </wp:anchor>
+        </w:drawing>
+      </w:r>
+      <w:r>
+        <w:rPr>
+          <w:rFonts w:ascii="Arial Narrow" w:hAnsi="Arial Narrow" w:cs="Arial"/>
+          <w:sz w:val="26"/>
+        </w:rPr>
+        <w:t>PEMERINTAH KABUPATEN BANDUNG BARAT</w:t>
+      </w:r>
+    </w:p>
+    <w:p>
+      <w:pPr>
+        <w:pStyle w:val="Header"/>
+        <w:ind w:left="720"/>
+        <w:jc w:val="center"/>
+        <w:rPr>
+          <w:rFonts w:ascii="Arial Narrow" w:hAnsi="Arial Narrow" w:cs="Arial"/>
+          <w:b/>
+          <w:sz w:val="32"/>
+          <w:lang w:val="id-ID"/>
+        </w:rPr>
+      </w:pPr>
+      <w:r>
+        <w:rPr>
+          <w:rFonts w:ascii="Arial Narrow" w:hAnsi="Arial Narrow" w:cs="Arial"/>
+          <w:b/>
+          <w:sz w:val="32"/>
+        </w:rPr>
+        <w:t>SD</w:t>
+      </w:r>
+      <w:r>
+        <w:rPr>
+          <w:rFonts w:ascii="Arial Narrow" w:hAnsi="Arial Narrow" w:cs="Arial"/>
+          <w:b/>
+          <w:sz w:val="32"/>
+          <w:lang w:val="id-ID"/>
+        </w:rPr>
+        <w:t xml:space="preserve"> NEGERI PASIRHALANG KECAMATAN CIKALONGWETAN</w:t>
+      </w:r>
+    </w:p>
+    <w:p>
+      <w:pPr>
+        <w:pStyle w:val="Header"/>
+        <w:ind w:left="720"/>
+        <w:jc w:val="center"/>
+        <w:rPr>
+          <w:rFonts w:ascii="Arial Narrow" w:hAnsi="Arial Narrow" w:cs="Arial"/>
+          <w:b/>
+          <w:sz w:val="38"/>
+          <w:lang w:val="id-ID"/>
+        </w:rPr>
+      </w:pPr>
+      <w:r>
+        <w:rPr>
+          <w:rFonts w:ascii="Arial Narrow" w:hAnsi="Arial Narrow" w:cs="Arial"/>
+          <w:b/>
+          <w:sz w:val="32"/>
+          <w:lang w:val="id-ID"/>
+        </w:rPr>
+        <w:t>DINAS PENDIDIKAN</w:t>
+      </w:r>
+    </w:p>
+    <w:p>
+      <w:pPr>
+        <w:pStyle w:val="Header"/>
+        <w:spacing w:line="276" w:lineRule="auto"/>
+        <w:jc w:val="center"/>
+        <w:rPr>
+          <w:rFonts w:ascii="Arial Narrow" w:hAnsi="Arial Narrow" w:cs="Arial"/>
+          <w:i/>
           <w:sz w:val="20"/>
           <w:lang w:val="id-ID"/>
         </w:rPr>
       </w:pPr>
-    </w:p>
-    <w:p>
-      <w:pPr>
-        <w:pStyle w:val="NoSpacing"/>
-        <w:jc w:val="center"/>
-        <w:rPr>
-          <w:rFonts w:ascii="Bookman Old Style" w:hAnsi="Bookman Old Style"/>
-          <w:b/>
-          <w:sz w:val="20"/>
-          <w:lang w:val="id-ID"/>
-        </w:rPr>
-      </w:pPr>
-    </w:p>
-    <w:p>
-      <w:pPr>
-        <w:pStyle w:val="NoSpacing"/>
-        <w:jc w:val="center"/>
-        <w:rPr>
-          <w:rFonts w:ascii="Bookman Old Style" w:hAnsi="Bookman Old Style"/>
-          <w:b/>
-          <w:sz w:val="20"/>
-          <w:lang w:val="id-ID"/>
-        </w:rPr>
-      </w:pPr>
-    </w:p>
-    <w:p>
-      <w:pPr>
-        <w:pStyle w:val="NoSpacing"/>
-        <w:jc w:val="center"/>
-        <w:rPr>
-          <w:rFonts w:ascii="Bookman Old Style" w:hAnsi="Bookman Old Style"/>
-          <w:b/>
-          <w:sz w:val="20"/>
-          <w:lang w:val="id-ID"/>
-        </w:rPr>
-      </w:pPr>
+      <w:r>
+        <w:rPr>
+          <w:rFonts w:ascii="Arial Narrow" w:hAnsi="Arial Narrow" w:cs="Arial"/>
+          <w:i/>
+          <w:sz w:val="16"/>
+        </w:rPr>
+        <w:tab/>
+      </w:r>
+      <w:proofErr w:type="gramStart"/>
+      <w:r>
+        <w:rPr>
+          <w:rFonts w:ascii="Arial Narrow" w:hAnsi="Arial Narrow" w:cs="Arial"/>
+          <w:i/>
+          <w:sz w:val="16"/>
+        </w:rPr>
+        <w:t>Alamat :</w:t>
+      </w:r>
+      <w:proofErr w:type="gramEnd"/>
+      <w:r>
+        <w:rPr>
+          <w:rFonts w:ascii="Arial Narrow" w:hAnsi="Arial Narrow" w:cs="Arial"/>
+          <w:i/>
+          <w:sz w:val="16"/>
+        </w:rPr>
+        <w:t xml:space="preserve"> </w:t>
+      </w:r>
+      <w:r>
+        <w:rPr>
+          <w:rFonts w:ascii="Arial Narrow" w:hAnsi="Arial Narrow" w:cs="Arial"/>
+          <w:i/>
+          <w:sz w:val="16"/>
+          <w:lang w:val="id-ID"/>
+        </w:rPr>
+        <w:t>Kp. Pasirhalang RT 03/014 Ds. Mandalamukti Kec. Cikalongwetan Kab. Bandung Barat Kode Pos : 40556</w:t>
+      </w:r>
+    </w:p>
+    <w:p>
+      <w:pPr>
+        <w:pStyle w:val="Header"/>
+        <w:jc w:val="center"/>
+        <w:rPr>
+          <w:i/>
+          <w:iCs/>
+        </w:rPr>
+      </w:pPr>
+      <w:r>
+        <w:rPr>
+          <w:i/>
+          <w:iCs/>
+        </w:rPr>
+        <w:softHyphen/>
+      </w:r>
+      <w:r>
+        <w:rPr>
+          <w:i/>
+          <w:iCs/>
+        </w:rPr>
+        <w:softHyphen/>
+      </w:r>
+      <w:r>
+        <w:rPr>
+          <w:i/>
+          <w:iCs/>
+        </w:rPr>
+        <w:softHyphen/>
+      </w:r>
+      <w:r>
+        <w:rPr>
+          <w:i/>
+          <w:iCs/>
+        </w:rPr>
+        <w:softHyphen/>
+      </w:r>
+      <w:r>
+        <w:rPr>
+          <w:i/>
+          <w:iCs/>
+        </w:rPr>
+        <w:softHyphen/>
+      </w:r>
+      <w:r>
+        <w:rPr>
+          <w:i/>
+          <w:iCs/>
+        </w:rPr>
+        <w:softHyphen/>
+      </w:r>
+      <w:r>
+        <w:rPr>
+          <w:i/>
+          <w:iCs/>
+        </w:rPr>
+        <w:softHyphen/>
+      </w:r>
+      <w:r>
+        <w:rPr>
+          <w:i/>
+          <w:iCs/>
+        </w:rPr>
+        <w:softHyphen/>
+      </w:r>
+      <w:r>
+        <w:rPr>
+          <w:i/>
+          <w:iCs/>
+        </w:rPr>
+        <w:softHyphen/>
+      </w:r>
+      <w:r>
+        <w:rPr>
+          <w:i/>
+          <w:iCs/>
+        </w:rPr>
+        <w:softHyphen/>
+      </w:r>
+      <w:r>
+        <w:rPr>
+          <w:i/>
+          <w:iCs/>
+        </w:rPr>
+        <w:softHyphen/>
+      </w:r>
+      <w:r>
+        <w:rPr>
+          <w:i/>
+          <w:iCs/>
+        </w:rPr>
+        <w:softHyphen/>
+      </w:r>
+      <w:r>
+        <w:rPr>
+          <w:i/>
+          <w:iCs/>
+        </w:rPr>
+        <w:softHyphen/>
+      </w:r>
+      <w:r>
+        <w:rPr>
+          <w:i/>
+          <w:iCs/>
+        </w:rPr>
+        <w:softHyphen/>
+      </w:r>
+      <w:r>
+        <w:rPr>
+          <w:i/>
+          <w:iCs/>
+        </w:rPr>
+        <w:softHyphen/>
+      </w:r>
+      <w:r>
+        <w:rPr>
+          <w:i/>
+          <w:iCs/>
+        </w:rPr>
+        <w:softHyphen/>
+      </w:r>
+      <w:r>
+        <w:rPr>
+          <w:i/>
+          <w:iCs/>
+        </w:rPr>
+        <w:softHyphen/>
+      </w:r>
+      <w:r>
+        <w:rPr>
+          <w:i/>
+          <w:iCs/>
+        </w:rPr>
+        <w:softHyphen/>
+      </w:r>
+      <w:r>
+        <w:rPr>
+          <w:i/>
+          <w:iCs/>
+        </w:rPr>
+        <w:softHyphen/>
+      </w:r>
+      <w:r>
+        <w:rPr>
+          <w:i/>
+          <w:iCs/>
+        </w:rPr>
+        <w:softHyphen/>
+        <w:t>______________________________________________________________________________________</w:t>
+      </w:r>
     </w:p>
     <w:p>
       <w:pPr>
@@ -2241,373 +2056,6 @@
           <w:lang w:val="id-ID"/>
         </w:rPr>
       </w:pPr>
-      <w:r>
-        <w:rPr>
-          <w:rFonts w:ascii="Bookman Old Style" w:hAnsi="Bookman Old Style"/>
-          <w:noProof/>
-          <w:sz w:val="20"/>
-          <w:lang w:val="id-ID" w:eastAsia="id-ID"/>
-        </w:rPr>
-        <mc:AlternateContent>
-          <mc:Choice Requires="wps">
-            <w:drawing>
-              <wp:anchor distT="0" distB="0" distL="114300" distR="114300" simplePos="0" relativeHeight="251659264" behindDoc="1" locked="0" layoutInCell="1" allowOverlap="1" wp14:anchorId="55FC8281" wp14:editId="53278300">
-                <wp:simplePos x="0" y="0"/>
-                <wp:positionH relativeFrom="margin">
-                  <wp:align>left</wp:align>
-                </wp:positionH>
-                <wp:positionV relativeFrom="paragraph">
-                  <wp:posOffset>43131</wp:posOffset>
-                </wp:positionV>
-                <wp:extent cx="6302326" cy="4058529"/>
-                <wp:effectExtent l="0" t="0" r="22860" b="18415"/>
-                <wp:wrapNone/>
-                <wp:docPr id="3" name="Rounded Rectangle 3"/>
-                <wp:cNvGraphicFramePr/>
-                <a:graphic xmlns:a="http://schemas.openxmlformats.org/drawingml/2006/main">
-                  <a:graphicData uri="http://schemas.microsoft.com/office/word/2010/wordprocessingShape">
-                    <wps:wsp>
-                      <wps:cNvSpPr/>
-                      <wps:spPr>
-                        <a:xfrm>
-                          <a:off x="0" y="0"/>
-                          <a:ext cx="6302326" cy="4058529"/>
-                        </a:xfrm>
-                        <a:prstGeom prst="roundRect">
-                          <a:avLst/>
-                        </a:prstGeom>
-                        <a:noFill/>
-                      </wps:spPr>
-                      <wps:style>
-                        <a:lnRef idx="2">
-                          <a:schemeClr val="dk1"/>
-                        </a:lnRef>
-                        <a:fillRef idx="1">
-                          <a:schemeClr val="lt1"/>
-                        </a:fillRef>
-                        <a:effectRef idx="0">
-                          <a:schemeClr val="dk1"/>
-                        </a:effectRef>
-                        <a:fontRef idx="minor">
-                          <a:schemeClr val="dk1"/>
-                        </a:fontRef>
-                      </wps:style>
-                      <wps:txbx>
-                        <w:txbxContent>
-                          <w:p>
-                            <w:pPr>
-                              <w:pStyle w:val="NoSpacing"/>
-                              <w:spacing w:line="360" w:lineRule="auto"/>
-                              <w:ind w:left="284" w:right="141"/>
-                              <w:jc w:val="center"/>
-                              <w:rPr>
-                                <w:rFonts w:ascii="Bookman Old Style" w:hAnsi="Bookman Old Style"/>
-                                <w:szCs w:val="24"/>
-                                <w:lang w:val="id-ID"/>
-                              </w:rPr>
-                            </w:pPr>
-                          </w:p>
-                          <w:p>
-                            <w:pPr>
-                              <w:pStyle w:val="NoSpacing"/>
-                              <w:rPr>
-                                <w:sz w:val="18"/>
-                                <w:lang w:val="id-ID"/>
-                              </w:rPr>
-                            </w:pPr>
-                          </w:p>
-                          <w:p>
-                            <w:pPr>
-                              <w:pStyle w:val="NoSpacing"/>
-                              <w:rPr>
-                                <w:sz w:val="18"/>
-                                <w:lang w:val="id-ID"/>
-                              </w:rPr>
-                            </w:pPr>
-                          </w:p>
-                          <w:p>
-                            <w:pPr>
-                              <w:pStyle w:val="NoSpacing"/>
-                              <w:rPr>
-                                <w:sz w:val="18"/>
-                                <w:lang w:val="id-ID"/>
-                              </w:rPr>
-                            </w:pPr>
-                          </w:p>
-                          <w:p>
-                            <w:pPr>
-                              <w:pStyle w:val="NoSpacing"/>
-                              <w:rPr>
-                                <w:sz w:val="18"/>
-                                <w:lang w:val="id-ID"/>
-                              </w:rPr>
-                            </w:pPr>
-                          </w:p>
-                          <w:p>
-                            <w:pPr>
-                              <w:pStyle w:val="NoSpacing"/>
-                              <w:rPr>
-                                <w:sz w:val="18"/>
-                                <w:lang w:val="id-ID"/>
-                              </w:rPr>
-                            </w:pPr>
-                          </w:p>
-                          <w:p>
-                            <w:pPr>
-                              <w:pStyle w:val="NoSpacing"/>
-                              <w:rPr>
-                                <w:sz w:val="18"/>
-                                <w:lang w:val="id-ID"/>
-                              </w:rPr>
-                            </w:pPr>
-                          </w:p>
-                          <w:p>
-                            <w:pPr>
-                              <w:pStyle w:val="NoSpacing"/>
-                              <w:rPr>
-                                <w:sz w:val="18"/>
-                                <w:lang w:val="id-ID"/>
-                              </w:rPr>
-                            </w:pPr>
-                          </w:p>
-                          <w:p>
-                            <w:pPr>
-                              <w:pStyle w:val="NoSpacing"/>
-                              <w:rPr>
-                                <w:sz w:val="18"/>
-                                <w:lang w:val="id-ID"/>
-                              </w:rPr>
-                            </w:pPr>
-                          </w:p>
-                          <w:p>
-                            <w:pPr>
-                              <w:pStyle w:val="NoSpacing"/>
-                              <w:rPr>
-                                <w:sz w:val="18"/>
-                                <w:lang w:val="id-ID"/>
-                              </w:rPr>
-                            </w:pPr>
-                          </w:p>
-                          <w:p>
-                            <w:pPr>
-                              <w:pStyle w:val="NoSpacing"/>
-                              <w:rPr>
-                                <w:sz w:val="18"/>
-                                <w:lang w:val="id-ID"/>
-                              </w:rPr>
-                            </w:pPr>
-                          </w:p>
-                          <w:p>
-                            <w:pPr>
-                              <w:pStyle w:val="NoSpacing"/>
-                              <w:rPr>
-                                <w:sz w:val="18"/>
-                                <w:lang w:val="id-ID"/>
-                              </w:rPr>
-                            </w:pPr>
-                          </w:p>
-                          <w:p>
-                            <w:pPr>
-                              <w:pStyle w:val="NoSpacing"/>
-                              <w:rPr>
-                                <w:sz w:val="18"/>
-                                <w:lang w:val="id-ID"/>
-                              </w:rPr>
-                            </w:pPr>
-                          </w:p>
-                          <w:p>
-                            <w:pPr>
-                              <w:pStyle w:val="NoSpacing"/>
-                              <w:rPr>
-                                <w:sz w:val="18"/>
-                                <w:lang w:val="id-ID"/>
-                              </w:rPr>
-                            </w:pPr>
-                          </w:p>
-                          <w:p>
-                            <w:pPr>
-                              <w:pStyle w:val="NoSpacing"/>
-                              <w:rPr>
-                                <w:sz w:val="18"/>
-                                <w:lang w:val="id-ID"/>
-                              </w:rPr>
-                            </w:pPr>
-                          </w:p>
-                          <w:p/>
-                        </w:txbxContent>
-                      </wps:txbx>
-                      <wps:bodyPr rot="0" spcFirstLastPara="0" vertOverflow="overflow" horzOverflow="overflow" vert="horz" wrap="square" lIns="91440" tIns="45720" rIns="91440" bIns="45720" numCol="1" spcCol="0" rtlCol="0" fromWordArt="0" anchor="ctr" anchorCtr="0" forceAA="0" compatLnSpc="1">
-                        <a:prstTxWarp prst="textNoShape">
-                          <a:avLst/>
-                        </a:prstTxWarp>
-                        <a:noAutofit/>
-                      </wps:bodyPr>
-                    </wps:wsp>
-                  </a:graphicData>
-                </a:graphic>
-                <wp14:sizeRelH relativeFrom="margin">
-                  <wp14:pctWidth>0</wp14:pctWidth>
-                </wp14:sizeRelH>
-                <wp14:sizeRelV relativeFrom="margin">
-                  <wp14:pctHeight>0</wp14:pctHeight>
-                </wp14:sizeRelV>
-              </wp:anchor>
-            </w:drawing>
-          </mc:Choice>
-          <mc:Fallback>
-            <w:pict>
-              <v:roundrect w14:anchorId="55FC8281" id="Rounded Rectangle 3" o:spid="_x0000_s1028" style="position:absolute;margin-left:0;margin-top:3.4pt;width:496.25pt;height:319.55pt;z-index:-251657216;visibility:visible;mso-wrap-style:square;mso-width-percent:0;mso-height-percent:0;mso-wrap-distance-left:9pt;mso-wrap-distance-top:0;mso-wrap-distance-right:9pt;mso-wrap-distance-bottom:0;mso-position-horizontal:left;mso-position-horizontal-relative:margin;mso-position-vertical:absolute;mso-position-vertical-relative:text;mso-width-percent:0;mso-height-percent:0;mso-width-relative:margin;mso-height-relative:margin;v-text-anchor:middle" arcsize="10923f" o:gfxdata="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" filled="f" strokecolor="black [3200]" strokeweight="1pt">
-                <v:stroke joinstyle="miter"/>
-                <v:textbox>
-                  <w:txbxContent>
-                    <w:p>
-                      <w:pPr>
-                        <w:pStyle w:val="NoSpacing"/>
-                        <w:spacing w:line="360" w:lineRule="auto"/>
-                        <w:ind w:left="284" w:right="141"/>
-                        <w:jc w:val="center"/>
-                        <w:rPr>
-                          <w:rFonts w:ascii="Bookman Old Style" w:hAnsi="Bookman Old Style"/>
-                          <w:szCs w:val="24"/>
-                          <w:lang w:val="id-ID"/>
-                        </w:rPr>
-                      </w:pPr>
-                    </w:p>
-                    <w:p>
-                      <w:pPr>
-                        <w:pStyle w:val="NoSpacing"/>
-                        <w:rPr>
-                          <w:sz w:val="18"/>
-                          <w:lang w:val="id-ID"/>
-                        </w:rPr>
-                      </w:pPr>
-                    </w:p>
-                    <w:p>
-                      <w:pPr>
-                        <w:pStyle w:val="NoSpacing"/>
-                        <w:rPr>
-                          <w:sz w:val="18"/>
-                          <w:lang w:val="id-ID"/>
-                        </w:rPr>
-                      </w:pPr>
-                    </w:p>
-                    <w:p>
-                      <w:pPr>
-                        <w:pStyle w:val="NoSpacing"/>
-                        <w:rPr>
-                          <w:sz w:val="18"/>
-                          <w:lang w:val="id-ID"/>
-                        </w:rPr>
-                      </w:pPr>
-                    </w:p>
-                    <w:p>
-                      <w:pPr>
-                        <w:pStyle w:val="NoSpacing"/>
-                        <w:rPr>
-                          <w:sz w:val="18"/>
-                          <w:lang w:val="id-ID"/>
-                        </w:rPr>
-                      </w:pPr>
-                    </w:p>
-                    <w:p>
-                      <w:pPr>
-                        <w:pStyle w:val="NoSpacing"/>
-                        <w:rPr>
-                          <w:sz w:val="18"/>
-                          <w:lang w:val="id-ID"/>
-                        </w:rPr>
-                      </w:pPr>
-                    </w:p>
-                    <w:p>
-                      <w:pPr>
-                        <w:pStyle w:val="NoSpacing"/>
-                        <w:rPr>
-                          <w:sz w:val="18"/>
-                          <w:lang w:val="id-ID"/>
-                        </w:rPr>
-                      </w:pPr>
-                    </w:p>
-                    <w:p>
-                      <w:pPr>
-                        <w:pStyle w:val="NoSpacing"/>
-                        <w:rPr>
-                          <w:sz w:val="18"/>
-                          <w:lang w:val="id-ID"/>
-                        </w:rPr>
-                      </w:pPr>
-                    </w:p>
-                    <w:p>
-                      <w:pPr>
-                        <w:pStyle w:val="NoSpacing"/>
-                        <w:rPr>
-                          <w:sz w:val="18"/>
-                          <w:lang w:val="id-ID"/>
-                        </w:rPr>
-                      </w:pPr>
-                    </w:p>
-                    <w:p>
-                      <w:pPr>
-                        <w:pStyle w:val="NoSpacing"/>
-                        <w:rPr>
-                          <w:sz w:val="18"/>
-                          <w:lang w:val="id-ID"/>
-                        </w:rPr>
-                      </w:pPr>
-                    </w:p>
-                    <w:p>
-                      <w:pPr>
-                        <w:pStyle w:val="NoSpacing"/>
-                        <w:rPr>
-                          <w:sz w:val="18"/>
-                          <w:lang w:val="id-ID"/>
-                        </w:rPr>
-                      </w:pPr>
-                    </w:p>
-                    <w:p>
-                      <w:pPr>
-                        <w:pStyle w:val="NoSpacing"/>
-                        <w:rPr>
-                          <w:sz w:val="18"/>
-                          <w:lang w:val="id-ID"/>
-                        </w:rPr>
-                      </w:pPr>
-                    </w:p>
-                    <w:p>
-                      <w:pPr>
-                        <w:pStyle w:val="NoSpacing"/>
-                        <w:rPr>
-                          <w:sz w:val="18"/>
-                          <w:lang w:val="id-ID"/>
-                        </w:rPr>
-                      </w:pPr>
-                    </w:p>
-                    <w:p>
-                      <w:pPr>
-                        <w:pStyle w:val="NoSpacing"/>
-                        <w:rPr>
-                          <w:sz w:val="18"/>
-                          <w:lang w:val="id-ID"/>
-                        </w:rPr>
-                      </w:pPr>
-                    </w:p>
-                    <w:p>
-                      <w:pPr>
-                        <w:pStyle w:val="NoSpacing"/>
-                        <w:rPr>
-                          <w:sz w:val="18"/>
-                          <w:lang w:val="id-ID"/>
-                        </w:rPr>
-                      </w:pPr>
-                    </w:p>
-                    <w:p/>
-                  </w:txbxContent>
-                </v:textbox>
-                <w10:wrap anchorx="margin"/>
-              </v:roundrect>
-            </w:pict>
-          </mc:Fallback>
-        </mc:AlternateContent>
-      </w:r>
     </w:p>
     <w:p>
       <w:pPr>
@@ -2643,216 +2091,6 @@
           <w:lang w:val="id-ID"/>
         </w:rPr>
         <w:t>SARAN/PESAN</w:t>
-      </w:r>
-    </w:p>
-    <w:p>
-      <w:pPr>
-        <w:pStyle w:val="NoSpacing"/>
-        <w:spacing w:line="360" w:lineRule="auto"/>
-        <w:ind w:left="284" w:right="141"/>
-        <w:jc w:val="center"/>
-        <w:rPr>
-          <w:rFonts w:ascii="Bookman Old Style" w:hAnsi="Bookman Old Style"/>
-          <w:szCs w:val="24"/>
-          <w:lang w:val="id-ID"/>
-        </w:rPr>
-      </w:pPr>
-      <w:r>
-        <w:rPr>
-          <w:rFonts w:ascii="Bookman Old Style" w:hAnsi="Bookman Old Style"/>
-          <w:szCs w:val="24"/>
-          <w:lang w:val="id-ID"/>
-        </w:rPr>
-        <w:t>.........................................................................................................................</w:t>
-      </w:r>
-    </w:p>
-    <w:p>
-      <w:pPr>
-        <w:pStyle w:val="NoSpacing"/>
-        <w:spacing w:line="360" w:lineRule="auto"/>
-        <w:ind w:left="284" w:right="141"/>
-        <w:jc w:val="center"/>
-        <w:rPr>
-          <w:rFonts w:ascii="Bookman Old Style" w:hAnsi="Bookman Old Style"/>
-          <w:szCs w:val="24"/>
-          <w:lang w:val="id-ID"/>
-        </w:rPr>
-      </w:pPr>
-      <w:r>
-        <w:rPr>
-          <w:rFonts w:ascii="Bookman Old Style" w:hAnsi="Bookman Old Style"/>
-          <w:szCs w:val="24"/>
-          <w:lang w:val="id-ID"/>
-        </w:rPr>
-        <w:t>.........................................................................................................................</w:t>
-      </w:r>
-    </w:p>
-    <w:p>
-      <w:pPr>
-        <w:pStyle w:val="NoSpacing"/>
-        <w:spacing w:line="360" w:lineRule="auto"/>
-        <w:ind w:left="284" w:right="141"/>
-        <w:jc w:val="center"/>
-        <w:rPr>
-          <w:rFonts w:ascii="Bookman Old Style" w:hAnsi="Bookman Old Style"/>
-          <w:szCs w:val="24"/>
-          <w:lang w:val="id-ID"/>
-        </w:rPr>
-      </w:pPr>
-      <w:r>
-        <w:rPr>
-          <w:rFonts w:ascii="Bookman Old Style" w:hAnsi="Bookman Old Style"/>
-          <w:szCs w:val="24"/>
-          <w:lang w:val="id-ID"/>
-        </w:rPr>
-        <w:t>.........................................................................................................................</w:t>
-      </w:r>
-    </w:p>
-    <w:p>
-      <w:pPr>
-        <w:pStyle w:val="NoSpacing"/>
-        <w:spacing w:line="360" w:lineRule="auto"/>
-        <w:ind w:left="284" w:right="141"/>
-        <w:jc w:val="center"/>
-        <w:rPr>
-          <w:rFonts w:ascii="Bookman Old Style" w:hAnsi="Bookman Old Style"/>
-          <w:szCs w:val="24"/>
-          <w:lang w:val="id-ID"/>
-        </w:rPr>
-      </w:pPr>
-      <w:r>
-        <w:rPr>
-          <w:rFonts w:ascii="Bookman Old Style" w:hAnsi="Bookman Old Style"/>
-          <w:szCs w:val="24"/>
-          <w:lang w:val="id-ID"/>
-        </w:rPr>
-        <w:t>.........................................................................................................................</w:t>
-      </w:r>
-    </w:p>
-    <w:p>
-      <w:pPr>
-        <w:pStyle w:val="NoSpacing"/>
-        <w:spacing w:line="360" w:lineRule="auto"/>
-        <w:ind w:left="284" w:right="141"/>
-        <w:jc w:val="center"/>
-        <w:rPr>
-          <w:rFonts w:ascii="Bookman Old Style" w:hAnsi="Bookman Old Style"/>
-          <w:szCs w:val="24"/>
-          <w:lang w:val="id-ID"/>
-        </w:rPr>
-      </w:pPr>
-      <w:r>
-        <w:rPr>
-          <w:rFonts w:ascii="Bookman Old Style" w:hAnsi="Bookman Old Style"/>
-          <w:szCs w:val="24"/>
-          <w:lang w:val="id-ID"/>
-        </w:rPr>
-        <w:t>.........................................................................................................................</w:t>
-      </w:r>
-    </w:p>
-    <w:p>
-      <w:pPr>
-        <w:pStyle w:val="NoSpacing"/>
-        <w:spacing w:line="360" w:lineRule="auto"/>
-        <w:ind w:left="284" w:right="141"/>
-        <w:jc w:val="center"/>
-        <w:rPr>
-          <w:rFonts w:ascii="Bookman Old Style" w:hAnsi="Bookman Old Style"/>
-          <w:szCs w:val="24"/>
-          <w:lang w:val="id-ID"/>
-        </w:rPr>
-      </w:pPr>
-      <w:r>
-        <w:rPr>
-          <w:rFonts w:ascii="Bookman Old Style" w:hAnsi="Bookman Old Style"/>
-          <w:szCs w:val="24"/>
-          <w:lang w:val="id-ID"/>
-        </w:rPr>
-        <w:t>.........................................................................................................................</w:t>
-      </w:r>
-    </w:p>
-    <w:p>
-      <w:pPr>
-        <w:pStyle w:val="NoSpacing"/>
-        <w:spacing w:line="360" w:lineRule="auto"/>
-        <w:ind w:left="284" w:right="141"/>
-        <w:jc w:val="center"/>
-        <w:rPr>
-          <w:rFonts w:ascii="Bookman Old Style" w:hAnsi="Bookman Old Style"/>
-          <w:szCs w:val="24"/>
-          <w:lang w:val="id-ID"/>
-        </w:rPr>
-      </w:pPr>
-      <w:r>
-        <w:rPr>
-          <w:rFonts w:ascii="Bookman Old Style" w:hAnsi="Bookman Old Style"/>
-          <w:szCs w:val="24"/>
-          <w:lang w:val="id-ID"/>
-        </w:rPr>
-        <w:t>.........................................................................................................................</w:t>
-      </w:r>
-    </w:p>
-    <w:p>
-      <w:pPr>
-        <w:pStyle w:val="NoSpacing"/>
-        <w:spacing w:line="360" w:lineRule="auto"/>
-        <w:ind w:left="284" w:right="141"/>
-        <w:jc w:val="center"/>
-        <w:rPr>
-          <w:rFonts w:ascii="Bookman Old Style" w:hAnsi="Bookman Old Style"/>
-          <w:szCs w:val="24"/>
-          <w:lang w:val="id-ID"/>
-        </w:rPr>
-      </w:pPr>
-      <w:r>
-        <w:rPr>
-          <w:rFonts w:ascii="Bookman Old Style" w:hAnsi="Bookman Old Style"/>
-          <w:szCs w:val="24"/>
-          <w:lang w:val="id-ID"/>
-        </w:rPr>
-        <w:t>.........................................................................................................................</w:t>
-      </w:r>
-    </w:p>
-    <w:p>
-      <w:pPr>
-        <w:pStyle w:val="NoSpacing"/>
-        <w:spacing w:line="360" w:lineRule="auto"/>
-        <w:ind w:left="284" w:right="141"/>
-        <w:jc w:val="center"/>
-        <w:rPr>
-          <w:rFonts w:ascii="Bookman Old Style" w:hAnsi="Bookman Old Style"/>
-          <w:szCs w:val="24"/>
-          <w:lang w:val="id-ID"/>
-        </w:rPr>
-      </w:pPr>
-      <w:r>
-        <w:rPr>
-          <w:rFonts w:ascii="Bookman Old Style" w:hAnsi="Bookman Old Style"/>
-          <w:szCs w:val="24"/>
-          <w:lang w:val="id-ID"/>
-        </w:rPr>
-        <w:t>.........................................................................................................................</w:t>
-      </w:r>
-    </w:p>
-    <w:p>
-      <w:pPr>
-        <w:pStyle w:val="NoSpacing"/>
-        <w:spacing w:line="360" w:lineRule="auto"/>
-        <w:ind w:left="284" w:right="141"/>
-        <w:jc w:val="center"/>
-        <w:rPr>
-          <w:rFonts w:ascii="Bookman Old Style" w:hAnsi="Bookman Old Style"/>
-          <w:szCs w:val="24"/>
-          <w:lang w:val="id-ID"/>
-        </w:rPr>
-      </w:pPr>
-      <w:r>
-        <w:rPr>
-          <w:rFonts w:ascii="Bookman Old Style" w:hAnsi="Bookman Old Style"/>
-          <w:szCs w:val="24"/>
-          <w:lang w:val="id-ID"/>
-        </w:rPr>
-        <w:t>.........................................................................................................................</w:t>
       </w:r>
     </w:p>
     <w:p>
@@ -3113,6 +2351,7 @@
                 <w:u w:val="single"/>
               </w:rPr>
             </w:pPr>
+            <w:proofErr w:type="spellStart"/>
             <w:r>
               <w:rPr>
                 <w:rFonts w:ascii="Tahoma" w:hAnsi="Tahoma" w:cs="Tahoma"/>
@@ -3121,7 +2360,18 @@
                 <w:szCs w:val="20"/>
                 <w:u w:val="single"/>
               </w:rPr>
-              <w:t xml:space="preserve">Badruddin, </w:t>
+              <w:t>Yuniarti</w:t>
+            </w:r>
+            <w:proofErr w:type="spellEnd"/>
+            <w:r>
+              <w:rPr>
+                <w:rFonts w:ascii="Tahoma" w:hAnsi="Tahoma" w:cs="Tahoma"/>
+                <w:b/>
+                <w:sz w:val="20"/>
+                <w:szCs w:val="20"/>
+                <w:u w:val="single"/>
+              </w:rPr>
+              <w:t xml:space="preserve">, </w:t>
             </w:r>
             <w:proofErr w:type="spellStart"/>
             <w:r>
@@ -3132,9 +2382,29 @@
                 <w:szCs w:val="20"/>
                 <w:u w:val="single"/>
               </w:rPr>
-              <w:t>S.Ag.</w:t>
+              <w:t>S.</w:t>
+            </w:r>
+            <w:r>
+              <w:rPr>
+                <w:rFonts w:ascii="Tahoma" w:hAnsi="Tahoma" w:cs="Tahoma"/>
+                <w:b/>
+                <w:sz w:val="20"/>
+                <w:szCs w:val="20"/>
+                <w:u w:val="single"/>
+              </w:rPr>
+              <w:t>Pd</w:t>
             </w:r>
             <w:proofErr w:type="spellEnd"/>
+            <w:r>
+              <w:rPr>
+                <w:rFonts w:ascii="Tahoma" w:hAnsi="Tahoma" w:cs="Tahoma"/>
+                <w:b/>
+                <w:sz w:val="20"/>
+                <w:szCs w:val="20"/>
+                <w:u w:val="single"/>
+              </w:rPr>
+              <w:t>.</w:t>
+            </w:r>
           </w:p>
           <w:p>
             <w:pPr>
@@ -3164,7 +2434,7 @@
                 <w:sz w:val="20"/>
                 <w:szCs w:val="20"/>
               </w:rPr>
-              <w:t xml:space="preserve"> 197405082014121002</w:t>
+              <w:t xml:space="preserve"> </w:t>
             </w:r>
             <w:r>
               <w:rPr>
@@ -3173,7 +2443,7 @@
                 <w:sz w:val="20"/>
                 <w:szCs w:val="20"/>
               </w:rPr>
-              <w:t xml:space="preserve"> </w:t>
+              <w:t>196607071986102005</w:t>
             </w:r>
           </w:p>
         </w:tc>
@@ -3181,7 +2451,7 @@
     </w:tbl>
     <w:p/>
     <w:sectPr>
-      <w:pgSz w:w="12242" w:h="18711" w:code="5"/>
+      <w:pgSz w:w="11906" w:h="16838" w:code="9"/>
       <w:pgMar w:top="992" w:right="1043" w:bottom="992" w:left="1418" w:header="709" w:footer="709" w:gutter="0"/>
       <w:cols w:space="708"/>
       <w:docGrid w:linePitch="360"/>
@@ -3191,7 +2461,7 @@
 </file>
 
 <file path=word/styles.xml><?xml version="1.0" encoding="utf-8"?>
-<w:styles xmlns:mc="http://schemas.openxmlformats.org/markup-compatibility/2006" xmlns:r="http://schemas.openxmlformats.org/officeDocument/2006/relationships" xmlns:w="http://schemas.openxmlformats.org/wordprocessingml/2006/main" xmlns:w14="http://schemas.microsoft.com/office/word/2010/wordml" xmlns:w15="http://schemas.microsoft.com/office/word/2012/wordml" xmlns:w16cex="http://schemas.microsoft.com/office/word/2018/wordml/cex" xmlns:w16cid="http://schemas.microsoft.com/office/word/2016/wordml/cid" xmlns:w16="http://schemas.microsoft.com/office/word/2018/wordml" xmlns:w16du="http://schemas.microsoft.com/office/word/2023/wordml/word16du" xmlns:w16sdtdh="http://schemas.microsoft.com/office/word/2020/wordml/sdtdatahash" xmlns:w16sdtfl="http://schemas.microsoft.com/office/word/2024/wordml/sdtformatlock" xmlns:w16se="http://schemas.microsoft.com/office/word/2015/wordml/symex" mc:Ignorable="w14 w15 w16se w16cid w16 w16cex w16sdtdh w16sdtfl w16du">
+<w:styles xmlns:mc="http://schemas.openxmlformats.org/markup-compatibility/2006" xmlns:r="http://schemas.openxmlformats.org/officeDocument/2006/relationships" xmlns:w="http://schemas.openxmlformats.org/wordprocessingml/2006/main" xmlns:w14="http://schemas.microsoft.com/office/word/2010/wordml" xmlns:w15="http://schemas.microsoft.com/office/word/2012/wordml" xmlns:w16cex="http://schemas.microsoft.com/office/word/2018/wordml/cex" xmlns:w16cid="http://schemas.microsoft.com/office/word/2016/wordml/cid" xmlns:w16="http://schemas.microsoft.com/office/word/2018/wordml" xmlns:w16sdtdh="http://schemas.microsoft.com/office/word/2020/wordml/sdtdatahash" xmlns:w16se="http://schemas.microsoft.com/office/word/2015/wordml/symex" mc:Ignorable="w14 w15 w16se w16cid w16 w16cex w16sdtdh">
   <w:docDefaults>
     <w:rPrDefault>
       <w:rPr>
@@ -3679,6 +2949,37 @@
       <w14:ligatures w14:val="none"/>
     </w:rPr>
   </w:style>
+  <w:style w:type="paragraph" w:styleId="Header">
+    <w:name w:val="header"/>
+    <w:basedOn w:val="Normal"/>
+    <w:link w:val="HeaderChar"/>
+    <w:uiPriority w:val="99"/>
+    <w:unhideWhenUsed/>
+    <w:rsid w:val="004E2278"/>
+    <w:pPr>
+      <w:tabs>
+        <w:tab w:val="center" w:pos="4680"/>
+        <w:tab w:val="right" w:pos="9360"/>
+      </w:tabs>
+      <w:spacing w:after="0" w:line="240" w:lineRule="auto"/>
+    </w:pPr>
+    <w:rPr>
+      <w:rFonts w:eastAsiaTheme="minorEastAsia"/>
+    </w:rPr>
+  </w:style>
+  <w:style w:type="character" w:customStyle="1" w:styleId="HeaderChar">
+    <w:name w:val="Header Char"/>
+    <w:basedOn w:val="DefaultParagraphFont"/>
+    <w:link w:val="Header"/>
+    <w:uiPriority w:val="99"/>
+    <w:rsid w:val="004E2278"/>
+    <w:rPr>
+      <w:rFonts w:eastAsiaTheme="minorEastAsia"/>
+      <w:kern w:val="0"/>
+      <w:lang w:val="en-US"/>
+      <w14:ligatures w14:val="none"/>
+    </w:rPr>
+  </w:style>
 </w:styles>
 </file>
 

</xml_diff>